<commit_message>
Update PRISMA identification counts from EndNote group counts
New EndNote XML upload was a broken 1-record export (no study data), so
study-level data is unchanged. The EndNote screenshot provided per-database
identification counts, now filled into the PRISMA 2020 figure:
Databases n=32,907 (PubMed 11,095; Scopus 14,191; WoS 5,481; BMC 1,983;
Google Scholar 141; JAMA 16), Registers n=6 (CENTRAL), Reports assessed
n=62 (pdf.V2). Downstream dedup/screening/inclusion nodes left blank
pending the screening audit trail. README documents re-export steps.

Co-Authored-By: Claude Opus 4.8 <noreply@anthropic.com>
Claude-Session: https://claude.ai/code/session_01DAGek7oHXZPvcShfZjiQHM
</commit_message>
<xml_diff>
--- a/outputs/AMR_Sepsis_extraction/1Fig.PRISMA_2020_flow_diagram_SRs.docx
+++ b/outputs/AMR_Sepsis_extraction/1Fig.PRISMA_2020_flow_diagram_SRs.docx
@@ -380,7 +380,7 @@
                                 <w:sz w:val="18"/>
                                 <w:szCs w:val="20"/>
                               </w:rPr>
-                              <w:t>= 0 )</w:t>
+                              <w:t>= )</w:t>
                             </w:r>
                             <w:proofErr w:type="gramEnd"/>
                           </w:p>
@@ -630,7 +630,7 @@
                           <w:sz w:val="18"/>
                           <w:szCs w:val="20"/>
                         </w:rPr>
-                        <w:t xml:space="preserve"> = 0 )</w:t>
+                        <w:t xml:space="preserve"> = )</w:t>
                       </w:r>
                     </w:p>
                     <w:p>
@@ -922,7 +922,7 @@
                                 <w:sz w:val="18"/>
                                 <w:szCs w:val="20"/>
                               </w:rPr>
-                              <w:t>= 62 )</w:t>
+                              <w:t>= 32907 )</w:t>
                             </w:r>
                             <w:proofErr w:type="gramEnd"/>
                           </w:p>
@@ -999,7 +999,7 @@
                                 <w:sz w:val="18"/>
                                 <w:szCs w:val="20"/>
                               </w:rPr>
-                              <w:t>= 0 )</w:t>
+                              <w:t>= 6 )</w:t>
                             </w:r>
                             <w:proofErr w:type="gramEnd"/>
                           </w:p>
@@ -1147,7 +1147,7 @@
                           <w:sz w:val="18"/>
                           <w:szCs w:val="20"/>
                         </w:rPr>
-                        <w:t xml:space="preserve"> = 62 )</w:t>
+                        <w:t xml:space="preserve"> = 32907 )</w:t>
                       </w:r>
                     </w:p>
                     <w:p>
@@ -1213,7 +1213,7 @@
                           <w:sz w:val="18"/>
                           <w:szCs w:val="20"/>
                         </w:rPr>
-                        <w:t xml:space="preserve"> = 0 )</w:t>
+                        <w:t xml:space="preserve"> = 6 )</w:t>
                       </w:r>
                     </w:p>
                   </w:txbxContent>
@@ -1754,7 +1754,7 @@
                                 <w:sz w:val="18"/>
                                 <w:szCs w:val="20"/>
                               </w:rPr>
-                              <w:t>= 62 )</w:t>
+                              <w:t>= )</w:t>
                             </w:r>
                             <w:proofErr w:type="gramEnd"/>
                           </w:p>
@@ -1847,7 +1847,7 @@
                           <w:sz w:val="18"/>
                           <w:szCs w:val="20"/>
                         </w:rPr>
-                        <w:t xml:space="preserve"> = 62 )</w:t>
+                        <w:t xml:space="preserve"> = )</w:t>
                       </w:r>
                     </w:p>
                   </w:txbxContent>
@@ -3396,7 +3396,7 @@
                                 <w:sz w:val="18"/>
                                 <w:szCs w:val="20"/>
                               </w:rPr>
-                              <w:t>= )</w:t>
+                              <w:t>= 62 )</w:t>
                             </w:r>
                             <w:proofErr w:type="gramEnd"/>
                           </w:p>
@@ -3525,7 +3525,7 @@
                           <w:sz w:val="18"/>
                           <w:szCs w:val="20"/>
                         </w:rPr>
-                        <w:t xml:space="preserve"> = )</w:t>
+                        <w:t xml:space="preserve"> = 62 )</w:t>
                       </w:r>
                     </w:p>
                   </w:txbxContent>

</xml_diff>

<commit_message>
Complete PRISMA nodes (real + NR) and add reconciliation calculator
- fill_prisma.py: fix reconciliation crash when reason counts are non-
  numeric (e.g. NR placeholders)
- PRISMA docx: every node now populated -- real numbers where known
  (Databases 32,907; Registers 6; Reports assessed 62), NR where the
  screening audit is still required (no blank '(n = )')
- add PRISMA_reconciliation_calculator.xlsx: enter 4-5 EndNote group
  counts and all screening nodes compute with consistency checks

Co-Authored-By: Claude Opus 4.8 <noreply@anthropic.com>
Claude-Session: https://claude.ai/code/session_01DAGek7oHXZPvcShfZjiQHM
</commit_message>
<xml_diff>
--- a/outputs/AMR_Sepsis_extraction/1Fig.PRISMA_2020_flow_diagram_SRs.docx
+++ b/outputs/AMR_Sepsis_extraction/1Fig.PRISMA_2020_flow_diagram_SRs.docx
@@ -380,7 +380,7 @@
                                 <w:sz w:val="18"/>
                                 <w:szCs w:val="20"/>
                               </w:rPr>
-                              <w:t>= )</w:t>
+                              <w:t>= NR )</w:t>
                             </w:r>
                             <w:proofErr w:type="gramEnd"/>
                           </w:p>
@@ -430,7 +430,7 @@
                                 <w:sz w:val="18"/>
                                 <w:szCs w:val="20"/>
                               </w:rPr>
-                              <w:t>= )</w:t>
+                              <w:t>= NR )</w:t>
                             </w:r>
                             <w:proofErr w:type="gramEnd"/>
                           </w:p>
@@ -498,7 +498,7 @@
                                 <w:sz w:val="18"/>
                                 <w:szCs w:val="20"/>
                               </w:rPr>
-                              <w:t>= )</w:t>
+                              <w:t>= NR )</w:t>
                             </w:r>
                             <w:proofErr w:type="gramEnd"/>
                           </w:p>
@@ -630,7 +630,7 @@
                           <w:sz w:val="18"/>
                           <w:szCs w:val="20"/>
                         </w:rPr>
-                        <w:t xml:space="preserve"> = )</w:t>
+                        <w:t xml:space="preserve"> = NR )</w:t>
                       </w:r>
                     </w:p>
                     <w:p>
@@ -669,7 +669,7 @@
                           <w:sz w:val="18"/>
                           <w:szCs w:val="20"/>
                         </w:rPr>
-                        <w:t xml:space="preserve"> = )</w:t>
+                        <w:t xml:space="preserve"> = NR )</w:t>
                       </w:r>
                     </w:p>
                     <w:p>
@@ -726,7 +726,7 @@
                           <w:sz w:val="18"/>
                           <w:szCs w:val="20"/>
                         </w:rPr>
-                        <w:t xml:space="preserve"> = )</w:t>
+                        <w:t xml:space="preserve"> = NR )</w:t>
                       </w:r>
                     </w:p>
                   </w:txbxContent>
@@ -1754,7 +1754,7 @@
                                 <w:sz w:val="18"/>
                                 <w:szCs w:val="20"/>
                               </w:rPr>
-                              <w:t>= )</w:t>
+                              <w:t>= NR )</w:t>
                             </w:r>
                             <w:proofErr w:type="gramEnd"/>
                           </w:p>
@@ -1847,7 +1847,7 @@
                           <w:sz w:val="18"/>
                           <w:szCs w:val="20"/>
                         </w:rPr>
-                        <w:t xml:space="preserve"> = )</w:t>
+                        <w:t xml:space="preserve"> = NR )</w:t>
                       </w:r>
                     </w:p>
                   </w:txbxContent>
@@ -2006,7 +2006,7 @@
                                 <w:sz w:val="18"/>
                                 <w:szCs w:val="20"/>
                               </w:rPr>
-                              <w:t>= )</w:t>
+                              <w:t>= NR )</w:t>
                             </w:r>
                             <w:proofErr w:type="gramEnd"/>
                           </w:p>
@@ -2117,7 +2117,7 @@
                           <w:sz w:val="18"/>
                           <w:szCs w:val="20"/>
                         </w:rPr>
-                        <w:t xml:space="preserve"> = )</w:t>
+                        <w:t xml:space="preserve"> = NR )</w:t>
                       </w:r>
                     </w:p>
                   </w:txbxContent>
@@ -2388,7 +2388,7 @@
                                 <w:sz w:val="18"/>
                                 <w:szCs w:val="20"/>
                               </w:rPr>
-                              <w:t>= )</w:t>
+                              <w:t>= NR )</w:t>
                             </w:r>
                             <w:proofErr w:type="gramEnd"/>
                           </w:p>
@@ -2517,7 +2517,7 @@
                           <w:sz w:val="18"/>
                           <w:szCs w:val="20"/>
                         </w:rPr>
-                        <w:t xml:space="preserve"> = )</w:t>
+                        <w:t xml:space="preserve"> = NR )</w:t>
                       </w:r>
                     </w:p>
                   </w:txbxContent>
@@ -2763,7 +2763,7 @@
                                 <w:sz w:val="18"/>
                                 <w:szCs w:val="20"/>
                               </w:rPr>
-                              <w:t>= )</w:t>
+                              <w:t>= NR )</w:t>
                             </w:r>
                             <w:proofErr w:type="gramEnd"/>
                           </w:p>
@@ -2892,7 +2892,7 @@
                           <w:sz w:val="18"/>
                           <w:szCs w:val="20"/>
                         </w:rPr>
-                        <w:t xml:space="preserve"> = )</w:t>
+                        <w:t xml:space="preserve"> = NR )</w:t>
                       </w:r>
                     </w:p>
                   </w:txbxContent>
@@ -3712,7 +3712,7 @@
                                 <w:sz w:val="18"/>
                                 <w:szCs w:val="20"/>
                               </w:rPr>
-                              <w:t>= )</w:t>
+                              <w:t>= NR )</w:t>
                             </w:r>
                             <w:proofErr w:type="gramEnd"/>
                           </w:p>
@@ -3762,7 +3762,7 @@
                                 <w:sz w:val="18"/>
                                 <w:szCs w:val="20"/>
                               </w:rPr>
-                              <w:t>= )</w:t>
+                              <w:t>= NR )</w:t>
                             </w:r>
                             <w:proofErr w:type="gramEnd"/>
                           </w:p>
@@ -3812,7 +3812,7 @@
                                 <w:sz w:val="18"/>
                                 <w:szCs w:val="20"/>
                               </w:rPr>
-                              <w:t>= )</w:t>
+                              <w:t>= NR )</w:t>
                             </w:r>
                             <w:proofErr w:type="gramEnd"/>
                           </w:p>
@@ -3972,7 +3972,7 @@
                           <w:sz w:val="18"/>
                           <w:szCs w:val="20"/>
                         </w:rPr>
-                        <w:t xml:space="preserve"> = )</w:t>
+                        <w:t xml:space="preserve"> = NR )</w:t>
                       </w:r>
                     </w:p>
                     <w:p>
@@ -4011,7 +4011,7 @@
                           <w:sz w:val="18"/>
                           <w:szCs w:val="20"/>
                         </w:rPr>
-                        <w:t xml:space="preserve"> = )</w:t>
+                        <w:t xml:space="preserve"> = NR )</w:t>
                       </w:r>
                     </w:p>
                     <w:p>
@@ -4050,7 +4050,7 @@
                           <w:sz w:val="18"/>
                           <w:szCs w:val="20"/>
                         </w:rPr>
-                        <w:t xml:space="preserve"> = )</w:t>
+                        <w:t xml:space="preserve"> = NR )</w:t>
                       </w:r>
                     </w:p>
                     <w:p>
@@ -4307,7 +4307,7 @@
                                 <w:sz w:val="18"/>
                                 <w:szCs w:val="20"/>
                               </w:rPr>
-                              <w:t>= )</w:t>
+                              <w:t>= NR )</w:t>
                             </w:r>
                             <w:proofErr w:type="gramEnd"/>
                           </w:p>
@@ -4376,7 +4376,7 @@
                                 <w:sz w:val="18"/>
                                 <w:szCs w:val="20"/>
                               </w:rPr>
-                              <w:t>= )</w:t>
+                              <w:t>= NR )</w:t>
                             </w:r>
                             <w:proofErr w:type="gramEnd"/>
                           </w:p>
@@ -4460,7 +4460,7 @@
                           <w:sz w:val="18"/>
                           <w:szCs w:val="20"/>
                         </w:rPr>
-                        <w:t xml:space="preserve"> = )</w:t>
+                        <w:t xml:space="preserve"> = NR )</w:t>
                       </w:r>
                     </w:p>
                     <w:p>
@@ -4518,7 +4518,7 @@
                           <w:sz w:val="18"/>
                           <w:szCs w:val="20"/>
                         </w:rPr>
-                        <w:t xml:space="preserve"> = )</w:t>
+                        <w:t xml:space="preserve"> = NR )</w:t>
                       </w:r>
                     </w:p>
                   </w:txbxContent>

</xml_diff>